<commit_message>
revised version post de Quieroz comments
</commit_message>
<xml_diff>
--- a/Products/oreo-taxonomy-title-page.docx
+++ b/Products/oreo-taxonomy-title-page.docx
@@ -8,44 +8,18 @@
       </w:pPr>
       <w:r>
         <w:rPr>
+          <w:b w:val="1"/>
+          <w:bCs w:val="1"/>
           <w:rtl w:val="0"/>
           <w:lang w:val="en-US"/>
         </w:rPr>
-        <w:t xml:space="preserve">Revealing the arboreal frog genus </w:t>
+        <w:t>Unmasking a Cryptic Genus of New Guinea Frogs:</w:t>
       </w:r>
       <w:r>
         <w:rPr>
-          <w:rFonts w:ascii="Aptos Display" w:cs="Aptos Display" w:hAnsi="Aptos Display" w:eastAsia="Aptos Display"/>
-          <w:i w:val="1"/>
-          <w:iCs w:val="1"/>
-          <w:rtl w:val="0"/>
-          <w:lang w:val="en-US"/>
-        </w:rPr>
-        <w:t>Auparoparo</w:t>
-      </w:r>
-      <w:r>
-        <w:rPr>
-          <w:rtl w:val="0"/>
-          <w:lang w:val="en-US"/>
-        </w:rPr>
-        <w:t xml:space="preserve">: A new classification after 130 years of </w:t>
-      </w:r>
-      <w:r>
-        <w:rPr>
-          <w:rFonts w:ascii="Aptos Display" w:cs="Aptos Display" w:hAnsi="Aptos Display" w:eastAsia="Aptos Display"/>
-          <w:i w:val="1"/>
-          <w:iCs w:val="1"/>
-          <w:rtl w:val="0"/>
-          <w:lang w:val="en-US"/>
-        </w:rPr>
-        <w:t>Oreophryne</w:t>
-      </w:r>
-      <w:r>
-        <w:rPr>
-          <w:rtl w:val="0"/>
-          <w:lang w:val="en-US"/>
-        </w:rPr>
-        <w:t xml:space="preserve"> sensu lato, subfamily Asterophrinae (Anura: Microhylidae)</w:t>
+          <w:rtl w:val="0"/>
+        </w:rPr>
+        <w:t xml:space="preserve"> How Morphology Continues to Positively Mislead Evolutionary Study</w:t>
       </w:r>
     </w:p>
     <w:p>
@@ -138,7 +112,11 @@
           <w:ilvl w:val="0"/>
           <w:numId w:val="2"/>
         </w:numPr>
-        <w:rPr>
+        <w:bidi w:val="0"/>
+        <w:ind w:right="0"/>
+        <w:jc w:val="left"/>
+        <w:rPr>
+          <w:rtl w:val="0"/>
           <w:lang w:val="en-US"/>
         </w:rPr>
       </w:pPr>
@@ -157,7 +135,11 @@
           <w:ilvl w:val="0"/>
           <w:numId w:val="2"/>
         </w:numPr>
-        <w:rPr>
+        <w:bidi w:val="0"/>
+        <w:ind w:right="0"/>
+        <w:jc w:val="left"/>
+        <w:rPr>
+          <w:rtl w:val="0"/>
           <w:lang w:val="en-US"/>
         </w:rPr>
       </w:pPr>
@@ -176,7 +158,11 @@
           <w:ilvl w:val="0"/>
           <w:numId w:val="2"/>
         </w:numPr>
-        <w:rPr>
+        <w:bidi w:val="0"/>
+        <w:ind w:right="0"/>
+        <w:jc w:val="left"/>
+        <w:rPr>
+          <w:rtl w:val="0"/>
           <w:lang w:val="en-US"/>
         </w:rPr>
       </w:pPr>
@@ -197,7 +183,13 @@
           <w:rtl w:val="0"/>
           <w:lang w:val="en-US"/>
         </w:rPr>
-        <w:t>Running title: Auparoparo vs. Oreophryne</w:t>
+        <w:t xml:space="preserve">Running title: </w:t>
+      </w:r>
+      <w:r>
+        <w:rPr>
+          <w:rtl w:val="0"/>
+        </w:rPr>
+        <w:t>Cryptic genera can befuddle modern study</w:t>
       </w:r>
     </w:p>
     <w:p>
@@ -221,6 +213,7 @@
       </w:pPr>
       <w:r>
         <w:rPr>
+          <w:rFonts w:ascii="Aptos" w:cs="Aptos" w:hAnsi="Aptos" w:eastAsia="Aptos"/>
           <w:b w:val="1"/>
           <w:bCs w:val="1"/>
         </w:rPr>
@@ -231,15 +224,18 @@
       <w:pPr>
         <w:pStyle w:val="Body A"/>
         <w:rPr>
+          <w:rFonts w:ascii="Aptos" w:cs="Aptos" w:hAnsi="Aptos" w:eastAsia="Aptos"/>
           <w:b w:val="1"/>
           <w:bCs w:val="1"/>
         </w:rPr>
       </w:pPr>
       <w:r>
         <w:rPr>
+          <w:rFonts w:ascii="Aptos" w:cs="Aptos" w:hAnsi="Aptos" w:eastAsia="Aptos"/>
           <w:b w:val="1"/>
           <w:bCs w:val="1"/>
           <w:rtl w:val="0"/>
+          <w:lang w:val="en-US"/>
         </w:rPr>
         <w:t>Acknowledgements</w:t>
       </w:r>
@@ -256,11 +252,6 @@
         </w:rPr>
         <w:t xml:space="preserve">We thank Ben Evans and Iqbal Setiadi for generously providing samples critical for this study. We thank Neal Evenhuis for sharing expert knowledge on type species, and Brianna Correa and Alexis Shulga for providing comments which improved the manuscript. </w:t>
       </w:r>
-    </w:p>
-    <w:p>
-      <w:pPr>
-        <w:pStyle w:val="Body A"/>
-      </w:pPr>
       <w:r/>
     </w:p>
     <w:sectPr>

</xml_diff>